<commit_message>
Commit: el apartado de pagos ya funciona perfecto solo falta hablar con rijo para targeta
</commit_message>
<xml_diff>
--- a/Documentacion del proyecto.docx
+++ b/Documentacion del proyecto.docx
@@ -752,7 +752,27 @@
           <w:szCs w:val="32"/>
           <w:lang w:val="es-DO"/>
         </w:rPr>
-        <w:t xml:space="preserve">Diseño de reportes o informe de resultado en cada proyecto ej. Ver la ventas del </w:t>
+        <w:t xml:space="preserve">Diseño de reportes o informe de resultado en cada proyecto ej. Ver </w:t>
+      </w:r>
+      <w:proofErr w:type="gramStart"/>
+      <w:r>
+        <w:rPr>
+          <w:rFonts w:ascii="Times New Roman" w:hAnsi="Times New Roman" w:cs="Times New Roman"/>
+          <w:sz w:val="32"/>
+          <w:szCs w:val="32"/>
+          <w:lang w:val="es-DO"/>
+        </w:rPr>
+        <w:t>la ventas</w:t>
+      </w:r>
+      <w:proofErr w:type="gramEnd"/>
+      <w:r>
+        <w:rPr>
+          <w:rFonts w:ascii="Times New Roman" w:hAnsi="Times New Roman" w:cs="Times New Roman"/>
+          <w:sz w:val="32"/>
+          <w:szCs w:val="32"/>
+          <w:lang w:val="es-DO"/>
+        </w:rPr>
+        <w:t xml:space="preserve"> del </w:t>
       </w:r>
       <w:r>
         <w:rPr>
@@ -1879,34 +1899,7 @@
           <w:szCs w:val="32"/>
           <w:lang w:val="es-DO"/>
         </w:rPr>
-        <w:t>También empecé y</w:t>
-      </w:r>
-      <w:r>
-        <w:rPr>
-          <w:rFonts w:ascii="Times New Roman" w:hAnsi="Times New Roman" w:cs="Times New Roman"/>
-          <w:sz w:val="32"/>
-          <w:szCs w:val="32"/>
-          <w:lang w:val="es-DO"/>
-        </w:rPr>
-        <w:t xml:space="preserve"> </w:t>
-      </w:r>
-      <w:r>
-        <w:rPr>
-          <w:rFonts w:ascii="Times New Roman" w:hAnsi="Times New Roman" w:cs="Times New Roman"/>
-          <w:sz w:val="32"/>
-          <w:szCs w:val="32"/>
-          <w:lang w:val="es-DO"/>
-        </w:rPr>
-        <w:t>terminé</w:t>
-      </w:r>
-      <w:r>
-        <w:rPr>
-          <w:rFonts w:ascii="Times New Roman" w:hAnsi="Times New Roman" w:cs="Times New Roman"/>
-          <w:sz w:val="32"/>
-          <w:szCs w:val="32"/>
-          <w:lang w:val="es-DO"/>
-        </w:rPr>
-        <w:t xml:space="preserve"> algunas funcionalidades del dashboard como agregar usuarios, editar usuarios, enviar correos y captar errores.</w:t>
+        <w:t>También empecé y terminé algunas funcionalidades del dashboard como agregar usuarios, editar usuarios, enviar correos y captar errores.</w:t>
       </w:r>
     </w:p>
     <w:p>
@@ -1969,7 +1962,27 @@
           <w:szCs w:val="32"/>
           <w:lang w:val="es-DO"/>
         </w:rPr>
-        <w:t xml:space="preserve">En esta semana agregué la funcionalidad de los productos y categorías </w:t>
+        <w:t xml:space="preserve">En esta semana agregué </w:t>
+      </w:r>
+      <w:r>
+        <w:rPr>
+          <w:rFonts w:ascii="Times New Roman" w:hAnsi="Times New Roman" w:cs="Times New Roman"/>
+          <w:b/>
+          <w:bCs/>
+          <w:sz w:val="32"/>
+          <w:szCs w:val="32"/>
+          <w:lang w:val="es-DO"/>
+        </w:rPr>
+        <w:t>la</w:t>
+      </w:r>
+      <w:r>
+        <w:rPr>
+          <w:rFonts w:ascii="Times New Roman" w:hAnsi="Times New Roman" w:cs="Times New Roman"/>
+          <w:sz w:val="32"/>
+          <w:szCs w:val="32"/>
+          <w:lang w:val="es-DO"/>
+        </w:rPr>
+        <w:t xml:space="preserve"> funcionalidad de los productos y categorías </w:t>
       </w:r>
       <w:proofErr w:type="spellStart"/>
       <w:r>
@@ -1991,6 +2004,78 @@
         </w:rPr>
         <w:t xml:space="preserve"> hice una parte del apartado de los empleados que donde se renderizan los productos.</w:t>
       </w:r>
+    </w:p>
+    <w:p>
+      <w:pPr>
+        <w:rPr>
+          <w:rFonts w:ascii="Times New Roman" w:hAnsi="Times New Roman" w:cs="Times New Roman"/>
+          <w:b/>
+          <w:bCs/>
+          <w:sz w:val="36"/>
+          <w:szCs w:val="36"/>
+          <w:lang w:val="es-DO"/>
+        </w:rPr>
+      </w:pPr>
+      <w:r>
+        <w:rPr>
+          <w:rFonts w:ascii="Times New Roman" w:hAnsi="Times New Roman" w:cs="Times New Roman"/>
+          <w:b/>
+          <w:bCs/>
+          <w:sz w:val="36"/>
+          <w:szCs w:val="36"/>
+          <w:lang w:val="es-DO"/>
+        </w:rPr>
+        <w:t>Semana 5 – 6:</w:t>
+      </w:r>
+    </w:p>
+    <w:p>
+      <w:pPr>
+        <w:rPr>
+          <w:rFonts w:ascii="Times New Roman" w:hAnsi="Times New Roman" w:cs="Times New Roman"/>
+          <w:sz w:val="32"/>
+          <w:szCs w:val="32"/>
+          <w:lang w:val="es-DO"/>
+        </w:rPr>
+      </w:pPr>
+      <w:r>
+        <w:rPr>
+          <w:rFonts w:ascii="Times New Roman" w:hAnsi="Times New Roman" w:cs="Times New Roman"/>
+          <w:sz w:val="32"/>
+          <w:szCs w:val="32"/>
+          <w:lang w:val="es-DO"/>
+        </w:rPr>
+        <w:t xml:space="preserve">En estas 2 semanas implemente la mayor parte de la funcionalidad de escanear productos con QR y hice la parte de pagos de efectivo y transferencia solo </w:t>
+      </w:r>
+      <w:proofErr w:type="spellStart"/>
+      <w:r>
+        <w:rPr>
+          <w:rFonts w:ascii="Times New Roman" w:hAnsi="Times New Roman" w:cs="Times New Roman"/>
+          <w:sz w:val="32"/>
+          <w:szCs w:val="32"/>
+          <w:lang w:val="es-DO"/>
+        </w:rPr>
+        <w:t>front</w:t>
+      </w:r>
+      <w:proofErr w:type="spellEnd"/>
+      <w:r>
+        <w:rPr>
+          <w:rFonts w:ascii="Times New Roman" w:hAnsi="Times New Roman" w:cs="Times New Roman"/>
+          <w:sz w:val="32"/>
+          <w:szCs w:val="32"/>
+          <w:lang w:val="es-DO"/>
+        </w:rPr>
+        <w:t>-end.</w:t>
+      </w:r>
+    </w:p>
+    <w:p>
+      <w:pPr>
+        <w:rPr>
+          <w:rFonts w:ascii="Times New Roman" w:hAnsi="Times New Roman" w:cs="Times New Roman"/>
+          <w:sz w:val="32"/>
+          <w:szCs w:val="32"/>
+          <w:lang w:val="es-DO"/>
+        </w:rPr>
+      </w:pPr>
     </w:p>
     <w:p>
       <w:pPr>

</xml_diff>